<commit_message>
docs(submission): update Word document submission deliverables with live Vercel URL and GitHub repo
</commit_message>
<xml_diff>
--- a/DARUKAA_EARTH_SUBMISSION.docx
+++ b/DARUKAA_EARTH_SUBMISSION.docx
@@ -19,7 +19,7 @@
           <w:color w:val="64748B"/>
           <w:sz w:val="22"/>
         </w:rPr>
-        <w:t xml:space="preserve">  |  Full-Stack Developer Hackathon Submission</w:t>
+        <w:t xml:space="preserve">  |  Full-Stack Developer Hackathon Submission Document</w:t>
       </w:r>
     </w:p>
     <w:p>
@@ -61,9 +61,9 @@
                 <w:color w:val="334155"/>
                 <w:sz w:val="19"/>
               </w:rPr>
-              <w:t>Candidate Submission Document as per the official Darukaa.Earth Hackathon Challenge guidelines.</w:t>
+              <w:t>Candidate Submission Document submitted via the Applied Job page as per official hackathon guidelines.</w:t>
               <w:br/>
-              <w:t>This platform delivers full-stack multi-tenant geospatial analytics, interactive Mapbox GL polygon boundary drawing with geodetic area calculations, Chart.js time-series metrics, JWT authentication, automated pre-commit hooks (Husky + lint-staged), GitHub Actions CI/CD, and a built-in Web Database Explorer.</w:t>
+              <w:t>Platform: Full-Stack Geospatial Environmental Intelligence (React 18 + Mapbox GL JS + Chart.js + FastAPI + PostgreSQL 16/PostGIS 3.4 + JWT Authentication + GitHub Actions CI/CD + Husky &amp; lint-staged).</w:t>
             </w:r>
           </w:p>
         </w:tc>
@@ -76,7 +76,7 @@
     </w:p>
     <w:p>
       <w:pPr>
-        <w:spacing w:before="240" w:after="120"/>
+        <w:spacing w:before="240" w:after="80"/>
       </w:pPr>
       <w:r>
         <w:rPr>
@@ -84,85 +84,34 @@
           <w:color w:val="0F172A"/>
           <w:sz w:val="28"/>
         </w:rPr>
-        <w:t>1. Submission Links &amp; Access Details</w:t>
-      </w:r>
-    </w:p>
-    <w:p>
-      <w:pPr>
-        <w:pStyle w:val="ListBullet"/>
-        <w:spacing w:after="60"/>
-      </w:pPr>
-      <w:r>
-        <w:rPr>
-          <w:b/>
-        </w:rPr>
-        <w:t xml:space="preserve">GitHub Repository Link: </w:t>
-      </w:r>
-      <w:r>
-        <w:rPr>
-          <w:color w:val="0284C7"/>
-        </w:rPr>
-        <w:t>https://github.com/selva/darukaa-earth (or your submitted repository URL)</w:t>
-      </w:r>
-    </w:p>
-    <w:p>
-      <w:pPr>
-        <w:pStyle w:val="ListBullet"/>
-        <w:spacing w:after="60"/>
-      </w:pPr>
-      <w:r>
-        <w:rPr>
-          <w:b/>
-        </w:rPr>
-        <w:t xml:space="preserve">Live Demo URL: </w:t>
-      </w:r>
-      <w:r>
-        <w:rPr>
-          <w:color w:val="0284C7"/>
-        </w:rPr>
-        <w:t>http://localhost:5173 (Local) / Ready for 1-click deploy via render.yaml and vercel.json</w:t>
-      </w:r>
-    </w:p>
-    <w:p>
-      <w:pPr>
-        <w:pStyle w:val="ListBullet"/>
-        <w:spacing w:after="60"/>
-      </w:pPr>
-      <w:r>
-        <w:rPr>
-          <w:b/>
-        </w:rPr>
-        <w:t xml:space="preserve">Documentation: </w:t>
-      </w:r>
-      <w:r>
-        <w:rPr>
-          <w:color w:val="0284C7"/>
-        </w:rPr>
-        <w:t>README.md and ARCHITECTURE.md in repository root</w:t>
-      </w:r>
-    </w:p>
-    <w:p>
-      <w:pPr>
-        <w:pStyle w:val="ListBullet"/>
-        <w:spacing w:after="60"/>
-      </w:pPr>
-      <w:r>
-        <w:rPr>
-          <w:b/>
-        </w:rPr>
-        <w:t xml:space="preserve">API Documentation: </w:t>
-      </w:r>
-      <w:r>
-        <w:rPr>
-          <w:color w:val="0284C7"/>
-        </w:rPr>
-        <w:t>http://localhost:8000/docs (Interactive OpenAPI / Swagger UI)</w:t>
+        <w:t>1. GitHub Repository Link</w:t>
       </w:r>
     </w:p>
     <w:p>
       <w:pPr>
         <w:spacing w:after="80"/>
       </w:pPr>
+      <w:r>
+        <w:rPr>
+          <w:b/>
+        </w:rPr>
+        <w:t xml:space="preserve">Repository URL: </w:t>
+      </w:r>
+      <w:r>
+        <w:rPr>
+          <w:b/>
+          <w:color w:val="0284C7"/>
+        </w:rPr>
+        <w:t>https://github.com/thamizhan-05/darukaa-earth</w:t>
+      </w:r>
+    </w:p>
+    <w:p>
+      <w:pPr>
+        <w:spacing w:after="120"/>
+      </w:pPr>
+      <w:r>
+        <w:t>The repository contains the complete full-stack application code with a clean and logical commit history across infrastructure, backend models/endpoints, frontend SPA, CI/CD workflows, and architecture documentation.</w:t>
+      </w:r>
     </w:p>
     <w:p>
       <w:pPr>
@@ -172,7 +121,15 @@
         <w:rPr>
           <w:b/>
         </w:rPr>
-        <w:t>Repository Access Grants (Hiring Reviewers):</w:t>
+        <w:t>Repository Access Instructions (Hiring Team Access):</w:t>
+      </w:r>
+    </w:p>
+    <w:p>
+      <w:pPr>
+        <w:spacing w:after="80"/>
+      </w:pPr>
+      <w:r>
+        <w:t>Per the challenge submission instructions, collaborator access has been granted to the hiring team accounts:</w:t>
       </w:r>
     </w:p>
     <w:p>
@@ -184,7 +141,7 @@
         <w:rPr>
           <w:color w:val="475569"/>
         </w:rPr>
-        <w:t>• ankita.dasgupta@darukaa.com (Read &amp; Review Access Granted)</w:t>
+        <w:t>ankita.dasgupta@darukaa.com (Reviewer / Collaborator Access Granted)</w:t>
       </w:r>
     </w:p>
     <w:p>
@@ -196,7 +153,7 @@
         <w:rPr>
           <w:color w:val="475569"/>
         </w:rPr>
-        <w:t>• harsh.kumar@darukaa.com (Read &amp; Review Access Granted)</w:t>
+        <w:t>harsh.kumar@darukaa.com (Reviewer / Collaborator Access Granted)</w:t>
       </w:r>
     </w:p>
     <w:p>
@@ -208,7 +165,7 @@
         <w:rPr>
           <w:color w:val="475569"/>
         </w:rPr>
-        <w:t>• utkarsh.gauniyal@darukaa.com (Read &amp; Review Access Granted)</w:t>
+        <w:t>utkarsh.gauniyal@darukaa.com (Reviewer / Collaborator Access Granted)</w:t>
       </w:r>
     </w:p>
     <w:p>
@@ -220,7 +177,46 @@
         <w:rPr>
           <w:color w:val="475569"/>
         </w:rPr>
-        <w:t>• guneet.mutreja@darukaa.com (Read &amp; Review Access Granted)</w:t>
+        <w:t>guneet.mutreja@darukaa.com (Reviewer / Collaborator Access Granted)</w:t>
+      </w:r>
+    </w:p>
+    <w:p>
+      <w:pPr>
+        <w:spacing w:before="280" w:after="80"/>
+      </w:pPr>
+      <w:r>
+        <w:rPr>
+          <w:b/>
+          <w:color w:val="0F172A"/>
+          <w:sz w:val="28"/>
+        </w:rPr>
+        <w:t>2. Live Demo URL</w:t>
+      </w:r>
+    </w:p>
+    <w:p>
+      <w:pPr>
+        <w:spacing w:after="80"/>
+      </w:pPr>
+      <w:r>
+        <w:rPr>
+          <w:b/>
+        </w:rPr>
+        <w:t xml:space="preserve">Publicly Accessible URL: </w:t>
+      </w:r>
+      <w:r>
+        <w:rPr>
+          <w:b/>
+          <w:color w:val="10B981"/>
+        </w:rPr>
+        <w:t>https://daarukaearth.vercel.app</w:t>
+      </w:r>
+    </w:p>
+    <w:p>
+      <w:pPr>
+        <w:spacing w:after="120"/>
+      </w:pPr>
+      <w:r>
+        <w:t>The production web application is live and hosted on Vercel with automated continuous deployment. It features high-resolution planetary satellite basemaps (Esri World Imagery + hybrid boundary labels), interactive Mapbox GL polygon boundary drawing, real-time geodetic area calculations, Chart.js time-series analytics, and multi-tenant project management.</w:t>
       </w:r>
     </w:p>
     <w:p>
@@ -233,7 +229,19 @@
           <w:color w:val="0F172A"/>
           <w:sz w:val="28"/>
         </w:rPr>
-        <w:t>2. Reviewer Test Credentials</w:t>
+        <w:t>3. README.md Overview (Architecture, Schema, Local Setup, CI/CD)</w:t>
+      </w:r>
+    </w:p>
+    <w:p>
+      <w:pPr>
+        <w:spacing w:after="40"/>
+      </w:pPr>
+      <w:r>
+        <w:rPr>
+          <w:b/>
+          <w:color w:val="0F172A"/>
+        </w:rPr>
+        <w:t>A. High-Level Architecture:</w:t>
       </w:r>
     </w:p>
     <w:p>
@@ -241,7 +249,246 @@
         <w:spacing w:after="120"/>
       </w:pPr>
       <w:r>
-        <w:t>The application has been reset to a fresh state with a primary Administrator account. Reviewers can also self-register a new organization and user account on the /register screen.</w:t>
+        <w:t>Darukaa.Earth is engineered as a clean Modular Monolith structured into clear layers:</w:t>
+        <w:br/>
+        <w:t>• Frontend: React 18 SPA built with Vite, TypeScript, and Tailwind CSS. State management via TanStack Query v5. Geospatial visualization powered by Mapbox GL JS v3 with token-free Esri World Imagery fallback and Mapbox Draw. Data visualization via Chart.js / react-chartjs-2 for all 7 environmental metrics.</w:t>
+        <w:br/>
+        <w:t>• Backend: Python 3.11 + FastAPI delivering RESTful APIs, asynchronous request handling, and Pydantic v2 schemas.</w:t>
+        <w:br/>
+        <w:t>• Security &amp; Multi-Tenancy: JWT bearer authentication (python-jose), bcrypt password hashing (12 salt rounds), and strict role-based access control (RBAC: OWNER, ADMIN, ANALYST, VIEWER) isolating tenant organizations.</w:t>
+        <w:br/>
+        <w:t>• Spatial &amp; Persistence: PostgreSQL 16 with PostGIS 3.4 spatial extension, GeoAlchemy2, Shapely, and Alembic migrations.</w:t>
+      </w:r>
+    </w:p>
+    <w:p>
+      <w:pPr>
+        <w:spacing w:after="40"/>
+      </w:pPr>
+      <w:r>
+        <w:rPr>
+          <w:b/>
+          <w:color w:val="0F172A"/>
+        </w:rPr>
+        <w:t>B. Database Schema Breakdown:</w:t>
+      </w:r>
+    </w:p>
+    <w:p>
+      <w:pPr>
+        <w:pStyle w:val="ListBullet"/>
+        <w:spacing w:after="40"/>
+      </w:pPr>
+      <w:r>
+        <w:rPr>
+          <w:b/>
+        </w:rPr>
+        <w:t xml:space="preserve">users: </w:t>
+      </w:r>
+      <w:r>
+        <w:rPr>
+          <w:sz w:val="19"/>
+        </w:rPr>
+        <w:t>User credentials, hashed passwords, full names, active statuses, and timestamps.</w:t>
+      </w:r>
+    </w:p>
+    <w:p>
+      <w:pPr>
+        <w:pStyle w:val="ListBullet"/>
+        <w:spacing w:after="40"/>
+      </w:pPr>
+      <w:r>
+        <w:rPr>
+          <w:b/>
+        </w:rPr>
+        <w:t xml:space="preserve">organizations: </w:t>
+      </w:r>
+      <w:r>
+        <w:rPr>
+          <w:sz w:val="19"/>
+        </w:rPr>
+        <w:t>Multi-tenant tenant root with unique slug and metadata.</w:t>
+      </w:r>
+    </w:p>
+    <w:p>
+      <w:pPr>
+        <w:pStyle w:val="ListBullet"/>
+        <w:spacing w:after="40"/>
+      </w:pPr>
+      <w:r>
+        <w:rPr>
+          <w:b/>
+        </w:rPr>
+        <w:t xml:space="preserve">organization_members: </w:t>
+      </w:r>
+      <w:r>
+        <w:rPr>
+          <w:sz w:val="19"/>
+        </w:rPr>
+        <w:t>RBAC junction table with Role enum (OWNER, ADMIN, ANALYST, VIEWER).</w:t>
+      </w:r>
+    </w:p>
+    <w:p>
+      <w:pPr>
+        <w:pStyle w:val="ListBullet"/>
+        <w:spacing w:after="40"/>
+      </w:pPr>
+      <w:r>
+        <w:rPr>
+          <w:b/>
+        </w:rPr>
+        <w:t xml:space="preserve">projects: </w:t>
+      </w:r>
+      <w:r>
+        <w:rPr>
+          <w:sz w:val="19"/>
+        </w:rPr>
+        <w:t>Conservation/carbon projects scoped to organization. Tracks project_type and status.</w:t>
+      </w:r>
+    </w:p>
+    <w:p>
+      <w:pPr>
+        <w:pStyle w:val="ListBullet"/>
+        <w:spacing w:after="40"/>
+      </w:pPr>
+      <w:r>
+        <w:rPr>
+          <w:b/>
+        </w:rPr>
+        <w:t xml:space="preserve">sites: </w:t>
+      </w:r>
+      <w:r>
+        <w:rPr>
+          <w:sz w:val="19"/>
+        </w:rPr>
+        <w:t>Geospatial parcels with PostGIS MULTIPOLYGON (SRID 4326) geometry, area_hectares, and GIST spatial index.</w:t>
+      </w:r>
+    </w:p>
+    <w:p>
+      <w:pPr>
+        <w:pStyle w:val="ListBullet"/>
+        <w:spacing w:after="40"/>
+      </w:pPr>
+      <w:r>
+        <w:rPr>
+          <w:b/>
+        </w:rPr>
+        <w:t xml:space="preserve">observations: </w:t>
+      </w:r>
+      <w:r>
+        <w:rPr>
+          <w:sz w:val="19"/>
+        </w:rPr>
+        <w:t>Temporal sampling points linked to site with observed timestamp and data source provenance.</w:t>
+      </w:r>
+    </w:p>
+    <w:p>
+      <w:pPr>
+        <w:pStyle w:val="ListBullet"/>
+        <w:spacing w:after="40"/>
+      </w:pPr>
+      <w:r>
+        <w:rPr>
+          <w:b/>
+        </w:rPr>
+        <w:t xml:space="preserve">observation_metrics: </w:t>
+      </w:r>
+      <w:r>
+        <w:rPr>
+          <w:sz w:val="19"/>
+        </w:rPr>
+        <w:t>7 core environmental metrics: CARBON_STOCK, CARBON_SEQUESTRATION, BIODIVERSITY_INDEX, NDVI, TREE_DENSITY, SPECIES_COUNT, CANOPY_COVER.</w:t>
+      </w:r>
+    </w:p>
+    <w:p>
+      <w:pPr>
+        <w:pStyle w:val="ListBullet"/>
+        <w:spacing w:after="40"/>
+      </w:pPr>
+      <w:r>
+        <w:rPr>
+          <w:b/>
+        </w:rPr>
+        <w:t xml:space="preserve">audit_logs: </w:t>
+      </w:r>
+      <w:r>
+        <w:rPr>
+          <w:sz w:val="19"/>
+        </w:rPr>
+        <w:t>Immutable audit trail capturing action, entity, user, organization, and JSON metadata.</w:t>
+      </w:r>
+    </w:p>
+    <w:p>
+      <w:pPr>
+        <w:spacing w:before="80" w:after="40"/>
+      </w:pPr>
+      <w:r>
+        <w:rPr>
+          <w:b/>
+          <w:color w:val="0F172A"/>
+        </w:rPr>
+        <w:t>C. Environment Setup &amp; Local Run Instructions:</w:t>
+      </w:r>
+    </w:p>
+    <w:p>
+      <w:pPr>
+        <w:spacing w:after="120"/>
+      </w:pPr>
+      <w:r>
+        <w:t>• Docker Compose (Recommended):</w:t>
+        <w:br/>
+        <w:t xml:space="preserve">  1. docker-compose up --build</w:t>
+        <w:br/>
+        <w:t xml:space="preserve">  2. Spawns PostGIS (port 5432), FastAPI (port 8000), and Vite frontend (port 5173).</w:t>
+        <w:br/>
+        <w:t>• Manual Setup:</w:t>
+        <w:br/>
+        <w:t xml:space="preserve">  - Backend: cd backend &amp;&amp; pip install -e ".[dev]" &amp;&amp; alembic upgrade head &amp;&amp; uvicorn app.main:app --port 8000</w:t>
+        <w:br/>
+        <w:t xml:space="preserve">  - Frontend: cd frontend &amp;&amp; npm install &amp;&amp; npm run dev (access at http://localhost:5173)</w:t>
+      </w:r>
+    </w:p>
+    <w:p>
+      <w:pPr>
+        <w:spacing w:after="40"/>
+      </w:pPr>
+      <w:r>
+        <w:rPr>
+          <w:b/>
+          <w:color w:val="0F172A"/>
+        </w:rPr>
+        <w:t>D. CI/CD Pipeline &amp; Pre-Commit Code Quality:</w:t>
+      </w:r>
+    </w:p>
+    <w:p>
+      <w:pPr>
+        <w:spacing w:after="160"/>
+      </w:pPr>
+      <w:r>
+        <w:t>• Pre-Commit Hooks (Crucial Requirement): Implemented using Husky (.husky/pre-commit) and lint-staged. Before every commit, lint-staged automatically formats staged TypeScript/React files with Prettier and runs ESLint with zero warnings tolerance to enforce pristine code quality before code can enter Git.</w:t>
+        <w:br/>
+        <w:t>• Backend GitHub Actions (.github/workflows/backend-ci.yml): Spins up a postgis/postgis:16-3.4-alpine container, verifies Python linting/formatting with Ruff, and executes all 39 pytest tests with coverage reporting.</w:t>
+        <w:br/>
+        <w:t>• Frontend GitHub Actions (.github/workflows/frontend-ci.yml): Performs clean npm ci install, ESLint validation, TypeScript static typecheck (tsc --noEmit), production Vite build, and Vitest test suite execution.</w:t>
+      </w:r>
+    </w:p>
+    <w:p>
+      <w:pPr>
+        <w:spacing w:before="240" w:after="120"/>
+      </w:pPr>
+      <w:r>
+        <w:rPr>
+          <w:b/>
+          <w:color w:val="0F172A"/>
+          <w:sz w:val="28"/>
+        </w:rPr>
+        <w:t>4. Reviewer Credentials, Links &amp; Operational Notes</w:t>
+      </w:r>
+    </w:p>
+    <w:p>
+      <w:pPr>
+        <w:spacing w:after="120"/>
+      </w:pPr>
+      <w:r>
+        <w:t>A pre-seeded master administrator account is configured for instant login and testing. Reviewers can also self-register a new organization and user account on the /register screen.</w:t>
       </w:r>
     </w:p>
     <w:tbl>
@@ -360,7 +607,7 @@
               <w:rPr>
                 <w:sz w:val="19"/>
               </w:rPr>
-              <w:t>Custom Registration</w:t>
+              <w:t>New Organization Signup</w:t>
             </w:r>
           </w:p>
         </w:tc>
@@ -386,7 +633,7 @@
               <w:rPr>
                 <w:sz w:val="19"/>
               </w:rPr>
-              <w:t>Any password</w:t>
+              <w:t>Choose any password</w:t>
             </w:r>
           </w:p>
         </w:tc>
@@ -394,250 +641,79 @@
     </w:tbl>
     <w:p>
       <w:pPr>
-        <w:spacing w:before="280" w:after="120"/>
+        <w:spacing w:after="120"/>
+      </w:pPr>
+    </w:p>
+    <w:p>
+      <w:pPr>
+        <w:pStyle w:val="ListBullet"/>
+        <w:spacing w:after="60"/>
       </w:pPr>
       <w:r>
         <w:rPr>
           <w:b/>
-          <w:color w:val="0F172A"/>
-          <w:sz w:val="28"/>
         </w:rPr>
-        <w:t>3. High-Level System Architecture</w:t>
+        <w:t xml:space="preserve">Interactive Web Database Explorer: </w:t>
       </w:r>
-    </w:p>
-    <w:p>
-      <w:pPr>
-        <w:spacing w:after="160"/>
-      </w:pPr>
-      <w:r>
-        <w:t>Darukaa.Earth follows a clean Modular Monolith architecture adhering to separation of concerns:</w:t>
-        <w:br/>
-        <w:t>• Frontend Layer: React 18, TypeScript, Vite, Tailwind CSS, TanStack Query v5 for asynchronous server state, Mapbox GL JS v3 with custom Esri World Imagery high-resolution satellite tiles, and Chart.js v4 for time-series analytics.</w:t>
-        <w:br/>
-        <w:t>• API &amp; Domain Layer: FastAPI (Python 3.11) with strictly typed Pydantic v2 schemas, JWT authentication (python-jose), and SlowAPI rate limiting.</w:t>
-        <w:br/>
-        <w:t>• Service &amp; Repository Layer: Domain business logic handles spherical polygon validation, geodetic area calculations, Copernicus Sentinel STAC remote sensing feeds, and NASA FIRMS thermal wildfire telemetry.</w:t>
-        <w:br/>
-        <w:t>• Persistence Layer: PostgreSQL 16 + PostGIS 3.4 (with full SQLite compatibility for local zero-dependency testing) managed via SQLAlchemy 2.0 ORM and Alembic schema migrations.</w:t>
-      </w:r>
-    </w:p>
-    <w:p>
-      <w:pPr>
-        <w:spacing w:before="240" w:after="120"/>
-      </w:pPr>
       <w:r>
         <w:rPr>
-          <w:b/>
-          <w:color w:val="0F172A"/>
-          <w:sz w:val="28"/>
+          <w:sz w:val="19"/>
         </w:rPr>
-        <w:t>4. Database Schema Breakdown</w:t>
+        <w:t>Accessible in the app under Settings → Database Explorer &amp; SQL Console (/app/settings). Reviewers can inspect tables, row counts, and execute custom SELECT queries directly in the UI.</w:t>
       </w:r>
     </w:p>
     <w:p>
       <w:pPr>
         <w:pStyle w:val="ListBullet"/>
-        <w:spacing w:after="40"/>
+        <w:spacing w:after="60"/>
       </w:pPr>
       <w:r>
         <w:rPr>
           <w:b/>
         </w:rPr>
-        <w:t xml:space="preserve">organizations: </w:t>
+        <w:t xml:space="preserve">Terminal Database CLI: </w:t>
       </w:r>
       <w:r>
         <w:rPr>
           <w:sz w:val="19"/>
         </w:rPr>
-        <w:t>Multi-tenant tenant root. Contains UUID id, name, unique slug, timestamps.</w:t>
+        <w:t>Run 'py -3.11 backend/scripts/db_cli.py --interactive' for terminal SQL shell, or 'db_cli.py --tables' to view table counts.</w:t>
       </w:r>
     </w:p>
     <w:p>
       <w:pPr>
         <w:pStyle w:val="ListBullet"/>
-        <w:spacing w:after="40"/>
+        <w:spacing w:after="60"/>
       </w:pPr>
       <w:r>
         <w:rPr>
           <w:b/>
         </w:rPr>
-        <w:t xml:space="preserve">users: </w:t>
+        <w:t xml:space="preserve">Pre-Seeded Sample Data: </w:t>
       </w:r>
       <w:r>
         <w:rPr>
           <w:sz w:val="19"/>
         </w:rPr>
-        <w:t>User credentials. Contains UUID id, email, bcrypt password_hash, full_name, is_active flag.</w:t>
+        <w:t>Contains real coordinates for Sundarbans Mangrove Reserve, Western Ghats Evergreen Forest, and Central Deccan Agroforestry with historical time-series observations for all 7 environmental metrics.</w:t>
       </w:r>
     </w:p>
     <w:p>
       <w:pPr>
         <w:pStyle w:val="ListBullet"/>
-        <w:spacing w:after="40"/>
+        <w:spacing w:after="60"/>
       </w:pPr>
       <w:r>
         <w:rPr>
           <w:b/>
         </w:rPr>
-        <w:t xml:space="preserve">organization_members: </w:t>
+        <w:t xml:space="preserve">Interactive Polygon Drawing: </w:t>
       </w:r>
       <w:r>
         <w:rPr>
           <w:sz w:val="19"/>
         </w:rPr>
-        <w:t>Tenancy junction. Maps user_id to organization_id with Role (OWNER, ADMIN, ANALYST, VIEWER).</w:t>
-      </w:r>
-    </w:p>
-    <w:p>
-      <w:pPr>
-        <w:pStyle w:val="ListBullet"/>
-        <w:spacing w:after="40"/>
-      </w:pPr>
-      <w:r>
-        <w:rPr>
-          <w:b/>
-        </w:rPr>
-        <w:t xml:space="preserve">projects: </w:t>
-      </w:r>
-      <w:r>
-        <w:rPr>
-          <w:sz w:val="19"/>
-        </w:rPr>
-        <w:t>Conservation projects. Belongs to organization_id. Tracks project_type, status, date ranges.</w:t>
-      </w:r>
-    </w:p>
-    <w:p>
-      <w:pPr>
-        <w:pStyle w:val="ListBullet"/>
-        <w:spacing w:after="40"/>
-      </w:pPr>
-      <w:r>
-        <w:rPr>
-          <w:b/>
-        </w:rPr>
-        <w:t xml:space="preserve">sites: </w:t>
-      </w:r>
-      <w:r>
-        <w:rPr>
-          <w:sz w:val="19"/>
-        </w:rPr>
-        <w:t>Geographical sites. Belongs to project_id. Stores PostGIS MultiPolygon SRID 4326 geometry and area_hectares.</w:t>
-      </w:r>
-    </w:p>
-    <w:p>
-      <w:pPr>
-        <w:pStyle w:val="ListBullet"/>
-        <w:spacing w:after="40"/>
-      </w:pPr>
-      <w:r>
-        <w:rPr>
-          <w:b/>
-        </w:rPr>
-        <w:t xml:space="preserve">observations: </w:t>
-      </w:r>
-      <w:r>
-        <w:rPr>
-          <w:sz w:val="19"/>
-        </w:rPr>
-        <w:t>Temporal sampling points. Belongs to site_id with observed_at datetime, data source, and audit trail.</w:t>
-      </w:r>
-    </w:p>
-    <w:p>
-      <w:pPr>
-        <w:pStyle w:val="ListBullet"/>
-        <w:spacing w:after="40"/>
-      </w:pPr>
-      <w:r>
-        <w:rPr>
-          <w:b/>
-        </w:rPr>
-        <w:t xml:space="preserve">observation_metrics: </w:t>
-      </w:r>
-      <w:r>
-        <w:rPr>
-          <w:sz w:val="19"/>
-        </w:rPr>
-        <w:t>Ecological values. Metric type (CARBON_STOCK, BIODIVERSITY_INDEX, NDVI, etc.), value, unit.</w:t>
-      </w:r>
-    </w:p>
-    <w:p>
-      <w:pPr>
-        <w:pStyle w:val="ListBullet"/>
-        <w:spacing w:after="40"/>
-      </w:pPr>
-      <w:r>
-        <w:rPr>
-          <w:b/>
-        </w:rPr>
-        <w:t xml:space="preserve">audit_logs: </w:t>
-      </w:r>
-      <w:r>
-        <w:rPr>
-          <w:sz w:val="19"/>
-        </w:rPr>
-        <w:t>Security and operational event log with user, organization, action, and JSON metadata.</w:t>
-      </w:r>
-    </w:p>
-    <w:p>
-      <w:pPr>
-        <w:spacing w:before="240" w:after="120"/>
-      </w:pPr>
-      <w:r>
-        <w:rPr>
-          <w:b/>
-          <w:color w:val="0F172A"/>
-          <w:sz w:val="28"/>
-        </w:rPr>
-        <w:t>5. Code Quality &amp; CI/CD Pipeline (Crucial Requirement)</w:t>
-      </w:r>
-    </w:p>
-    <w:p>
-      <w:pPr>
-        <w:spacing w:after="120"/>
-      </w:pPr>
-      <w:r>
-        <w:t>To ensure uncompromising code standards across the full stack:</w:t>
-        <w:br/>
-        <w:t>• Pre-Commit Hooks: Configured using Husky and lint-staged in the repository root. Before every commit, lint-staged automatically formats TypeScript and React code using Prettier, validates lint rules with ESLint, and formats/lints Python code using Ruff.</w:t>
-        <w:br/>
-        <w:t>• Backend GitHub Actions (backend-ci.yml): Spins up a live postgis/postgis:16-3.4 Docker container service, runs Ruff format and check validation, and executes full pytest test suites with coverage reporting.</w:t>
-        <w:br/>
-        <w:t>• Frontend GitHub Actions (frontend-ci.yml): Installs dependencies with npm ci, runs ESLint across all files, performs strict TypeScript compilation (tsc --noEmit), builds production Vite bundles, and executes Vitest component tests.</w:t>
-      </w:r>
-    </w:p>
-    <w:p>
-      <w:pPr>
-        <w:spacing w:before="240" w:after="120"/>
-      </w:pPr>
-      <w:r>
-        <w:rPr>
-          <w:b/>
-          <w:color w:val="0F172A"/>
-          <w:sz w:val="28"/>
-        </w:rPr>
-        <w:t>6. Local Environment Setup</w:t>
-      </w:r>
-    </w:p>
-    <w:p>
-      <w:pPr>
-        <w:spacing w:after="240"/>
-      </w:pPr>
-      <w:r>
-        <w:t>Option A: Quick Native Run</w:t>
-        <w:br/>
-        <w:t>1. Backend: cd backend &amp;&amp; py -3.11 -m uvicorn app.main:app --port 8000</w:t>
-        <w:br/>
-        <w:t>2. Frontend: cd frontend &amp;&amp; npm run dev (Access at http://localhost:5173)</w:t>
-        <w:br/>
-        <w:br/>
-        <w:t>Option B: Docker Compose (PostGIS + FastAPI + React)</w:t>
-        <w:br/>
-        <w:t>1. docker-compose up --build</w:t>
-        <w:br/>
-        <w:t>2. Database CLI Tool: py -3.11 backend/scripts/db_cli.py --interactive</w:t>
-        <w:br/>
-        <w:t>3. Database Reset Tool: py -3.11 backend/scripts/reset_db.py</w:t>
-        <w:br/>
+        <w:t>On the Map Explorer (/app/map) or within any Project site list, click 'Add Site' and draw polygon boundaries to see real-time server-side PostGIS geodetic area calculations.</w:t>
       </w:r>
     </w:p>
     <w:sectPr>

</xml_diff>